<commit_message>
ajout doc a la con des compétences
</commit_message>
<xml_diff>
--- a/Flutter.docx
+++ b/Flutter.docx
@@ -128,7 +128,7 @@
     <w:p>
       <w:r>
         <w:pict w14:anchorId="2503998D">
-          <v:rect id="_x0000_i1055" style="width:0;height:1.5pt" o:hralign="center" o:hrstd="t" o:hr="t" fillcolor="#a0a0a0" stroked="f"/>
+          <v:rect id="_x0000_i1025" style="width:0;height:1.5pt" o:hralign="center" o:hrstd="t" o:hr="t" fillcolor="#a0a0a0" stroked="f"/>
         </w:pict>
       </w:r>
     </w:p>
@@ -227,7 +227,7 @@
     <w:p>
       <w:r>
         <w:pict w14:anchorId="162688CC">
-          <v:rect id="_x0000_i1056" style="width:0;height:1.5pt" o:hralign="center" o:hrstd="t" o:hr="t" fillcolor="#a0a0a0" stroked="f"/>
+          <v:rect id="_x0000_i1026" style="width:0;height:1.5pt" o:hralign="center" o:hrstd="t" o:hr="t" fillcolor="#a0a0a0" stroked="f"/>
         </w:pict>
       </w:r>
     </w:p>
@@ -380,7 +380,7 @@
     <w:p>
       <w:r>
         <w:pict w14:anchorId="5F5AB407">
-          <v:rect id="_x0000_i1057" style="width:0;height:1.5pt" o:hralign="center" o:hrstd="t" o:hr="t" fillcolor="#a0a0a0" stroked="f"/>
+          <v:rect id="_x0000_i1027" style="width:0;height:1.5pt" o:hralign="center" o:hrstd="t" o:hr="t" fillcolor="#a0a0a0" stroked="f"/>
         </w:pict>
       </w:r>
     </w:p>
@@ -549,7 +549,7 @@
     <w:p>
       <w:r>
         <w:pict w14:anchorId="35B95A0B">
-          <v:rect id="_x0000_i1058" style="width:0;height:1.5pt" o:hralign="center" o:hrstd="t" o:hr="t" fillcolor="#a0a0a0" stroked="f"/>
+          <v:rect id="_x0000_i1028" style="width:0;height:1.5pt" o:hralign="center" o:hrstd="t" o:hr="t" fillcolor="#a0a0a0" stroked="f"/>
         </w:pict>
       </w:r>
     </w:p>
@@ -680,7 +680,7 @@
     <w:p>
       <w:r>
         <w:pict w14:anchorId="22C0283F">
-          <v:rect id="_x0000_i1059" style="width:0;height:1.5pt" o:hralign="center" o:hrstd="t" o:hr="t" fillcolor="#a0a0a0" stroked="f"/>
+          <v:rect id="_x0000_i1029" style="width:0;height:1.5pt" o:hralign="center" o:hrstd="t" o:hr="t" fillcolor="#a0a0a0" stroked="f"/>
         </w:pict>
       </w:r>
     </w:p>
@@ -2080,6 +2080,9 @@
         </w:tabs>
       </w:pPr>
       <w:r>
+        <w:rPr>
+          <w:noProof/>
+        </w:rPr>
         <w:drawing>
           <wp:inline distT="0" distB="0" distL="0" distR="0" wp14:anchorId="7B5476BE" wp14:editId="725C3F2C">
             <wp:extent cx="1066949" cy="781159"/>
@@ -2123,6 +2126,9 @@
         <w:t xml:space="preserve"> </w:t>
       </w:r>
       <w:r>
+        <w:rPr>
+          <w:noProof/>
+        </w:rPr>
         <w:drawing>
           <wp:inline distT="0" distB="0" distL="0" distR="0" wp14:anchorId="31E7F508" wp14:editId="2AB014DD">
             <wp:extent cx="1162212" cy="1086002"/>
@@ -2329,6 +2335,9 @@
         </w:tabs>
       </w:pPr>
       <w:r>
+        <w:rPr>
+          <w:noProof/>
+        </w:rPr>
         <w:drawing>
           <wp:inline distT="0" distB="0" distL="0" distR="0" wp14:anchorId="7716AA3B" wp14:editId="69508FB9">
             <wp:extent cx="5760720" cy="1190625"/>
@@ -4924,6 +4933,7 @@
   <w:style w:type="character" w:default="1" w:styleId="Policepardfaut">
     <w:name w:val="Default Paragraph Font"/>
     <w:uiPriority w:val="1"/>
+    <w:semiHidden/>
     <w:unhideWhenUsed/>
   </w:style>
   <w:style w:type="table" w:default="1" w:styleId="TableauNormal">

</xml_diff>